<commit_message>
Tarea SEM6 subida a Google Drive
</commit_message>
<xml_diff>
--- a/Tareas realizadas Word/ACTIVI PRACTICA Y EVALUACION  SEM 6.docx
+++ b/Tareas realizadas Word/ACTIVI PRACTICA Y EVALUACION  SEM 6.docx
@@ -1,6 +1,6 @@
 
 <file path=word/document.xml><?xml version="1.0" encoding="utf-8"?>
-<w:document xmlns:wpc="http://schemas.microsoft.com/office/word/2010/wordprocessingCanvas" xmlns:cx="http://schemas.microsoft.com/office/drawing/2014/chartex" xmlns:cx1="http://schemas.microsoft.com/office/drawing/2015/9/8/chartex" xmlns:mc="http://schemas.openxmlformats.org/markup-compatibility/2006" xmlns:o="urn:schemas-microsoft-com:office:office" xmlns:r="http://schemas.openxmlformats.org/officeDocument/2006/relationships" xmlns:m="http://schemas.openxmlformats.org/officeDocument/2006/math" xmlns:v="urn:schemas-microsoft-com:vml" xmlns:wp14="http://schemas.microsoft.com/office/word/2010/wordprocessingDrawing" xmlns:wp="http://schemas.openxmlformats.org/drawingml/2006/wordprocessingDrawing" xmlns:w10="urn:schemas-microsoft-com:office:word" xmlns:w="http://schemas.openxmlformats.org/wordprocessingml/2006/main" xmlns:w14="http://schemas.microsoft.com/office/word/2010/wordml" xmlns:w15="http://schemas.microsoft.com/office/word/2012/wordml" xmlns:w16se="http://schemas.microsoft.com/office/word/2015/wordml/symex" xmlns:wpg="http://schemas.microsoft.com/office/word/2010/wordprocessingGroup" xmlns:wpi="http://schemas.microsoft.com/office/word/2010/wordprocessingInk" xmlns:wne="http://schemas.microsoft.com/office/word/2006/wordml" xmlns:wps="http://schemas.microsoft.com/office/word/2010/wordprocessingShape" mc:Ignorable="w14 w15 w16se wp14">
+<w:document xmlns:wpc="http://schemas.microsoft.com/office/word/2010/wordprocessingCanvas" xmlns:cx="http://schemas.microsoft.com/office/drawing/2014/chartex" xmlns:cx1="http://schemas.microsoft.com/office/drawing/2015/9/8/chartex" xmlns:cx2="http://schemas.microsoft.com/office/drawing/2015/10/21/chartex" xmlns:cx3="http://schemas.microsoft.com/office/drawing/2016/5/9/chartex" xmlns:cx4="http://schemas.microsoft.com/office/drawing/2016/5/10/chartex" xmlns:cx5="http://schemas.microsoft.com/office/drawing/2016/5/11/chartex" xmlns:cx6="http://schemas.microsoft.com/office/drawing/2016/5/12/chartex" xmlns:cx7="http://schemas.microsoft.com/office/drawing/2016/5/13/chartex" xmlns:cx8="http://schemas.microsoft.com/office/drawing/2016/5/14/chartex" xmlns:mc="http://schemas.openxmlformats.org/markup-compatibility/2006" xmlns:aink="http://schemas.microsoft.com/office/drawing/2016/ink" xmlns:am3d="http://schemas.microsoft.com/office/drawing/2017/model3d" xmlns:o="urn:schemas-microsoft-com:office:office" xmlns:r="http://schemas.openxmlformats.org/officeDocument/2006/relationships" xmlns:m="http://schemas.openxmlformats.org/officeDocument/2006/math" xmlns:v="urn:schemas-microsoft-com:vml" xmlns:wp14="http://schemas.microsoft.com/office/word/2010/wordprocessingDrawing" xmlns:wp="http://schemas.openxmlformats.org/drawingml/2006/wordprocessingDrawing" xmlns:w10="urn:schemas-microsoft-com:office:word" xmlns:w="http://schemas.openxmlformats.org/wordprocessingml/2006/main" xmlns:w14="http://schemas.microsoft.com/office/word/2010/wordml" xmlns:w15="http://schemas.microsoft.com/office/word/2012/wordml" xmlns:w16cex="http://schemas.microsoft.com/office/word/2018/wordml/cex" xmlns:w16cid="http://schemas.microsoft.com/office/word/2016/wordml/cid" xmlns:w16="http://schemas.microsoft.com/office/word/2018/wordml" xmlns:w16sdtdh="http://schemas.microsoft.com/office/word/2020/wordml/sdtdatahash" xmlns:w16se="http://schemas.microsoft.com/office/word/2015/wordml/symex" xmlns:wpg="http://schemas.microsoft.com/office/word/2010/wordprocessingGroup" xmlns:wpi="http://schemas.microsoft.com/office/word/2010/wordprocessingInk" xmlns:wne="http://schemas.microsoft.com/office/word/2006/wordml" xmlns:wps="http://schemas.microsoft.com/office/word/2010/wordprocessingShape" mc:Ignorable="w14 w15 w16se w16cid w16 w16cex w16sdtdh wp14">
   <w:body>
     <w:p>
       <w:pPr>
@@ -23,7 +23,7 @@
           <w:lang w:val="es-US"/>
         </w:rPr>
         <w:drawing>
-          <wp:inline distT="0" distB="0" distL="0" distR="0">
+          <wp:inline distT="0" distB="0" distL="0" distR="0" wp14:anchorId="051B892F" wp14:editId="0C6A94C9">
             <wp:extent cx="2059305" cy="588645"/>
             <wp:effectExtent l="0" t="0" r="0" b="0"/>
             <wp:docPr id="6" name="image1.png"/>
@@ -271,94 +271,97 @@
           <w:between w:val="nil"/>
         </w:pBdr>
         <w:spacing w:after="0"/>
-        <w:ind w:left="1080"/>
-        <w:jc w:val="both"/>
-        <w:rPr>
-          <w:rFonts w:ascii="Arial" w:eastAsia="Arial" w:hAnsi="Arial" w:cs="Arial"/>
-          <w:color w:val="000000"/>
-          <w:sz w:val="24"/>
-          <w:szCs w:val="24"/>
-        </w:rPr>
-      </w:pPr>
-      <w:r>
-        <w:rPr>
-          <w:rFonts w:ascii="Arial" w:eastAsia="Arial" w:hAnsi="Arial" w:cs="Arial"/>
-          <w:color w:val="000000"/>
-          <w:sz w:val="24"/>
-          <w:szCs w:val="24"/>
-        </w:rPr>
-        <w:t>El documento es la </w:t>
-      </w:r>
-      <w:r>
-        <w:rPr>
-          <w:rFonts w:ascii="Arial" w:eastAsia="Arial" w:hAnsi="Arial" w:cs="Arial"/>
-          <w:bCs/>
-          <w:color w:val="000000"/>
-          <w:sz w:val="24"/>
-          <w:szCs w:val="24"/>
-        </w:rPr>
-        <w:t>Parte VIII del Manual de Auditoría Gubernamental de Nicaragua</w:t>
-      </w:r>
-      <w:r>
-        <w:rPr>
-          <w:rFonts w:ascii="Arial" w:eastAsia="Arial" w:hAnsi="Arial" w:cs="Arial"/>
-          <w:color w:val="000000"/>
-          <w:sz w:val="24"/>
-          <w:szCs w:val="24"/>
-        </w:rPr>
-        <w:t>, enfocado en la </w:t>
-      </w:r>
-      <w:r>
-        <w:rPr>
-          <w:rFonts w:ascii="Arial" w:eastAsia="Arial" w:hAnsi="Arial" w:cs="Arial"/>
-          <w:bCs/>
-          <w:color w:val="000000"/>
-          <w:sz w:val="24"/>
-          <w:szCs w:val="24"/>
-        </w:rPr>
-        <w:t>Auditoría Informática</w:t>
-      </w:r>
-      <w:r>
-        <w:rPr>
-          <w:rFonts w:ascii="Arial" w:eastAsia="Arial" w:hAnsi="Arial" w:cs="Arial"/>
-          <w:color w:val="000000"/>
-          <w:sz w:val="24"/>
-          <w:szCs w:val="24"/>
-        </w:rPr>
-        <w:t xml:space="preserve">. Establece el marco normativo basado en las NAGUN para examinar la eficiencia, eficacia y seguridad de los recursos de Tecnología de Información en entidades públicas. Define un proceso estructurado en tres fases: Planeación (recopilación de información y evaluación de riesgos), Ejecución (aplicación de técnicas manuales y </w:t>
-      </w:r>
-      <w:proofErr w:type="spellStart"/>
-      <w:r>
-        <w:rPr>
-          <w:rFonts w:ascii="Arial" w:eastAsia="Arial" w:hAnsi="Arial" w:cs="Arial"/>
-          <w:color w:val="000000"/>
-          <w:sz w:val="24"/>
-          <w:szCs w:val="24"/>
-        </w:rPr>
-        <w:t>CAATs</w:t>
-      </w:r>
-      <w:proofErr w:type="spellEnd"/>
-      <w:r>
-        <w:rPr>
-          <w:rFonts w:ascii="Arial" w:eastAsia="Arial" w:hAnsi="Arial" w:cs="Arial"/>
-          <w:color w:val="000000"/>
-          <w:sz w:val="24"/>
-          <w:szCs w:val="24"/>
-        </w:rPr>
-        <w:t>) y Comunicación de Resultados (estructura del informe). Su objetivo es evaluar el control interno informático, desde la seguridad física del centro de cómputo hasta la integridad lógica de los datos y aplicaciones. Finalmente, provee anexos con modelos prácticos de cuestionarios y programas de auditoría específicos</w:t>
-      </w:r>
-    </w:p>
-    <w:p>
-      <w:pPr>
-        <w:pBdr>
-          <w:top w:val="nil"/>
-          <w:left w:val="nil"/>
-          <w:bottom w:val="nil"/>
-          <w:right w:val="nil"/>
-          <w:between w:val="nil"/>
-        </w:pBdr>
-        <w:spacing w:after="0"/>
-        <w:ind w:left="1080"/>
+        <w:ind w:left="1440"/>
+        <w:jc w:val="both"/>
+        <w:rPr>
+          <w:rFonts w:ascii="Arial" w:eastAsia="Arial" w:hAnsi="Arial" w:cs="Arial"/>
+          <w:color w:val="000000"/>
+          <w:sz w:val="24"/>
+          <w:szCs w:val="24"/>
+          <w:lang w:val="es-US"/>
+        </w:rPr>
+      </w:pPr>
+      <w:r>
+        <w:rPr>
+          <w:rFonts w:ascii="Arial" w:eastAsia="Arial" w:hAnsi="Arial" w:cs="Arial"/>
+          <w:color w:val="000000"/>
+          <w:sz w:val="24"/>
+          <w:szCs w:val="24"/>
+          <w:lang w:val="es-US"/>
+        </w:rPr>
+        <w:t>El documento detalla cómo estructurar y ejecutar la planeación de una auditoría informática organizacional</w:t>
+      </w:r>
+      <w:r>
+        <w:rPr>
+          <w:rFonts w:ascii="Arial" w:eastAsia="Arial" w:hAnsi="Arial" w:cs="Arial"/>
+          <w:color w:val="000000"/>
+          <w:sz w:val="24"/>
+          <w:szCs w:val="24"/>
+          <w:lang w:val="es-US"/>
+        </w:rPr>
+        <w:t>, también p</w:t>
+      </w:r>
+      <w:r>
+        <w:rPr>
+          <w:rFonts w:ascii="Arial" w:eastAsia="Arial" w:hAnsi="Arial" w:cs="Arial"/>
+          <w:color w:val="000000"/>
+          <w:sz w:val="24"/>
+          <w:szCs w:val="24"/>
+          <w:lang w:val="es-US"/>
+        </w:rPr>
+        <w:t>ropone el uso de marcos de referencia como COBIT para evaluar los procesos y los controles internos</w:t>
+      </w:r>
+      <w:r>
+        <w:rPr>
+          <w:rFonts w:ascii="Arial" w:eastAsia="Arial" w:hAnsi="Arial" w:cs="Arial"/>
+          <w:color w:val="000000"/>
+          <w:sz w:val="24"/>
+          <w:szCs w:val="24"/>
+          <w:lang w:val="es-US"/>
+        </w:rPr>
+        <w:t>. Este también a su vez, a</w:t>
+      </w:r>
+      <w:r>
+        <w:rPr>
+          <w:rFonts w:ascii="Arial" w:eastAsia="Arial" w:hAnsi="Arial" w:cs="Arial"/>
+          <w:color w:val="000000"/>
+          <w:sz w:val="24"/>
+          <w:szCs w:val="24"/>
+          <w:lang w:val="es-US"/>
+        </w:rPr>
+        <w:t>barca áreas críticas como la evaluación de sistemas, seguridad física y lógica, redes y bases de datos.</w:t>
+      </w:r>
+      <w:r>
+        <w:rPr>
+          <w:rFonts w:ascii="Arial" w:eastAsia="Arial" w:hAnsi="Arial" w:cs="Arial"/>
+          <w:color w:val="000000"/>
+          <w:sz w:val="24"/>
+          <w:szCs w:val="24"/>
+          <w:lang w:val="es-US"/>
+        </w:rPr>
+        <w:t xml:space="preserve"> En los documentos encontramos </w:t>
+      </w:r>
+      <w:r>
+        <w:rPr>
+          <w:rFonts w:ascii="Arial" w:eastAsia="Arial" w:hAnsi="Arial" w:cs="Arial"/>
+          <w:color w:val="000000"/>
+          <w:sz w:val="24"/>
+          <w:szCs w:val="24"/>
+          <w:lang w:val="es-US"/>
+        </w:rPr>
+        <w:t>cuestionarios y anexos prácticos para facilitar el levantamiento de datos y la generación de informes.</w:t>
+      </w:r>
+    </w:p>
+    <w:p>
+      <w:pPr>
+        <w:pBdr>
+          <w:top w:val="nil"/>
+          <w:left w:val="nil"/>
+          <w:bottom w:val="nil"/>
+          <w:right w:val="nil"/>
+          <w:between w:val="nil"/>
+        </w:pBdr>
+        <w:spacing w:after="0"/>
         <w:jc w:val="both"/>
         <w:rPr>
           <w:rFonts w:ascii="Arial" w:eastAsia="Arial" w:hAnsi="Arial" w:cs="Arial"/>
@@ -456,383 +459,55 @@
           <w:szCs w:val="24"/>
         </w:rPr>
       </w:pPr>
-      <w:r>
-        <w:rPr>
-          <w:rFonts w:ascii="Arial" w:eastAsia="Arial" w:hAnsi="Arial" w:cs="Arial"/>
-          <w:color w:val="000000"/>
-          <w:sz w:val="24"/>
-          <w:szCs w:val="24"/>
-        </w:rPr>
-        <w:t>La metodología utilizada en el manual es la adopción y adaptación de estándares internacionales al contexto legal nicaragüense. Específicamente:</w:t>
-      </w:r>
-    </w:p>
-    <w:p>
-      <w:pPr>
-        <w:pBdr>
-          <w:top w:val="nil"/>
-          <w:left w:val="nil"/>
-          <w:bottom w:val="nil"/>
-          <w:right w:val="nil"/>
-          <w:between w:val="nil"/>
-        </w:pBdr>
-        <w:spacing w:after="0"/>
-        <w:ind w:left="1440"/>
-        <w:jc w:val="both"/>
-        <w:rPr>
-          <w:rFonts w:ascii="Arial" w:eastAsia="Arial" w:hAnsi="Arial" w:cs="Arial"/>
-          <w:color w:val="000000"/>
-          <w:sz w:val="24"/>
-          <w:szCs w:val="24"/>
-        </w:rPr>
-      </w:pPr>
-    </w:p>
-    <w:p>
-      <w:pPr>
-        <w:pBdr>
-          <w:top w:val="nil"/>
-          <w:left w:val="nil"/>
-          <w:bottom w:val="nil"/>
-          <w:right w:val="nil"/>
-          <w:between w:val="nil"/>
-        </w:pBdr>
-        <w:spacing w:after="0"/>
-        <w:ind w:left="1440"/>
-        <w:jc w:val="both"/>
-        <w:rPr>
-          <w:rFonts w:ascii="Arial" w:eastAsia="Arial" w:hAnsi="Arial" w:cs="Arial"/>
-          <w:color w:val="000000"/>
-          <w:sz w:val="24"/>
-          <w:szCs w:val="24"/>
-        </w:rPr>
-      </w:pPr>
-      <w:r>
-        <w:rPr>
-          <w:rFonts w:ascii="Arial" w:eastAsia="Arial" w:hAnsi="Arial" w:cs="Arial"/>
-          <w:color w:val="000000"/>
-          <w:sz w:val="24"/>
-          <w:szCs w:val="24"/>
-        </w:rPr>
-        <w:t>Base Normativa Superior: Se fundamenta en las NAGUN (Normas de Auditoría Gubernamental de Nicaragua), citando explícitamente las secciones 2.10-2.90 y 10.10-10.30.</w:t>
-      </w:r>
-    </w:p>
-    <w:p>
-      <w:pPr>
-        <w:pBdr>
-          <w:top w:val="nil"/>
-          <w:left w:val="nil"/>
-          <w:bottom w:val="nil"/>
-          <w:right w:val="nil"/>
-          <w:between w:val="nil"/>
-        </w:pBdr>
-        <w:spacing w:after="0"/>
-        <w:ind w:left="1440"/>
-        <w:jc w:val="both"/>
-        <w:rPr>
-          <w:rFonts w:ascii="Arial" w:eastAsia="Arial" w:hAnsi="Arial" w:cs="Arial"/>
-          <w:color w:val="000000"/>
-          <w:sz w:val="24"/>
-          <w:szCs w:val="24"/>
-        </w:rPr>
-      </w:pPr>
-    </w:p>
-    <w:p>
-      <w:pPr>
-        <w:pBdr>
-          <w:top w:val="nil"/>
-          <w:left w:val="nil"/>
-          <w:bottom w:val="nil"/>
-          <w:right w:val="nil"/>
-          <w:between w:val="nil"/>
-        </w:pBdr>
-        <w:spacing w:after="0"/>
-        <w:ind w:left="1440"/>
-        <w:jc w:val="both"/>
-        <w:rPr>
-          <w:rFonts w:ascii="Arial" w:eastAsia="Arial" w:hAnsi="Arial" w:cs="Arial"/>
-          <w:color w:val="000000"/>
-          <w:sz w:val="24"/>
-          <w:szCs w:val="24"/>
-        </w:rPr>
-      </w:pPr>
-      <w:r>
-        <w:rPr>
-          <w:rFonts w:ascii="Arial" w:eastAsia="Arial" w:hAnsi="Arial" w:cs="Arial"/>
-          <w:color w:val="000000"/>
-          <w:sz w:val="24"/>
-          <w:szCs w:val="24"/>
-        </w:rPr>
-        <w:t>Alineación con Marcos de Control: Integra los conceptos del modelo COSO (</w:t>
-      </w:r>
-      <w:proofErr w:type="spellStart"/>
-      <w:r>
-        <w:rPr>
-          <w:rFonts w:ascii="Arial" w:eastAsia="Arial" w:hAnsi="Arial" w:cs="Arial"/>
-          <w:color w:val="000000"/>
-          <w:sz w:val="24"/>
-          <w:szCs w:val="24"/>
-        </w:rPr>
-        <w:t>Committee</w:t>
-      </w:r>
-      <w:proofErr w:type="spellEnd"/>
-      <w:r>
-        <w:rPr>
-          <w:rFonts w:ascii="Arial" w:eastAsia="Arial" w:hAnsi="Arial" w:cs="Arial"/>
-          <w:color w:val="000000"/>
-          <w:sz w:val="24"/>
-          <w:szCs w:val="24"/>
-        </w:rPr>
-        <w:t xml:space="preserve"> of </w:t>
-      </w:r>
-      <w:proofErr w:type="spellStart"/>
-      <w:r>
-        <w:rPr>
-          <w:rFonts w:ascii="Arial" w:eastAsia="Arial" w:hAnsi="Arial" w:cs="Arial"/>
-          <w:color w:val="000000"/>
-          <w:sz w:val="24"/>
-          <w:szCs w:val="24"/>
-        </w:rPr>
-        <w:t>Sponsoring</w:t>
-      </w:r>
-      <w:proofErr w:type="spellEnd"/>
-      <w:r>
-        <w:rPr>
-          <w:rFonts w:ascii="Arial" w:eastAsia="Arial" w:hAnsi="Arial" w:cs="Arial"/>
-          <w:color w:val="000000"/>
-          <w:sz w:val="24"/>
-          <w:szCs w:val="24"/>
-        </w:rPr>
-        <w:t xml:space="preserve"> </w:t>
-      </w:r>
-      <w:proofErr w:type="spellStart"/>
-      <w:r>
-        <w:rPr>
-          <w:rFonts w:ascii="Arial" w:eastAsia="Arial" w:hAnsi="Arial" w:cs="Arial"/>
-          <w:color w:val="000000"/>
-          <w:sz w:val="24"/>
-          <w:szCs w:val="24"/>
-        </w:rPr>
-        <w:t>Organizations</w:t>
-      </w:r>
-      <w:proofErr w:type="spellEnd"/>
-      <w:r>
-        <w:rPr>
-          <w:rFonts w:ascii="Arial" w:eastAsia="Arial" w:hAnsi="Arial" w:cs="Arial"/>
-          <w:color w:val="000000"/>
-          <w:sz w:val="24"/>
-          <w:szCs w:val="24"/>
-        </w:rPr>
-        <w:t xml:space="preserve"> of </w:t>
-      </w:r>
-      <w:proofErr w:type="spellStart"/>
-      <w:r>
-        <w:rPr>
-          <w:rFonts w:ascii="Arial" w:eastAsia="Arial" w:hAnsi="Arial" w:cs="Arial"/>
-          <w:color w:val="000000"/>
-          <w:sz w:val="24"/>
-          <w:szCs w:val="24"/>
-        </w:rPr>
-        <w:t>the</w:t>
-      </w:r>
-      <w:proofErr w:type="spellEnd"/>
-      <w:r>
-        <w:rPr>
-          <w:rFonts w:ascii="Arial" w:eastAsia="Arial" w:hAnsi="Arial" w:cs="Arial"/>
-          <w:color w:val="000000"/>
-          <w:sz w:val="24"/>
-          <w:szCs w:val="24"/>
-        </w:rPr>
-        <w:t xml:space="preserve"> </w:t>
-      </w:r>
-      <w:proofErr w:type="spellStart"/>
-      <w:r>
-        <w:rPr>
-          <w:rFonts w:ascii="Arial" w:eastAsia="Arial" w:hAnsi="Arial" w:cs="Arial"/>
-          <w:color w:val="000000"/>
-          <w:sz w:val="24"/>
-          <w:szCs w:val="24"/>
-        </w:rPr>
-        <w:t>Treadway</w:t>
-      </w:r>
-      <w:proofErr w:type="spellEnd"/>
-      <w:r>
-        <w:rPr>
-          <w:rFonts w:ascii="Arial" w:eastAsia="Arial" w:hAnsi="Arial" w:cs="Arial"/>
-          <w:color w:val="000000"/>
-          <w:sz w:val="24"/>
-          <w:szCs w:val="24"/>
-        </w:rPr>
-        <w:t xml:space="preserve"> </w:t>
-      </w:r>
-      <w:proofErr w:type="spellStart"/>
-      <w:r>
-        <w:rPr>
-          <w:rFonts w:ascii="Arial" w:eastAsia="Arial" w:hAnsi="Arial" w:cs="Arial"/>
-          <w:color w:val="000000"/>
-          <w:sz w:val="24"/>
-          <w:szCs w:val="24"/>
-        </w:rPr>
-        <w:t>Commission</w:t>
-      </w:r>
-      <w:proofErr w:type="spellEnd"/>
-      <w:r>
-        <w:rPr>
-          <w:rFonts w:ascii="Arial" w:eastAsia="Arial" w:hAnsi="Arial" w:cs="Arial"/>
-          <w:color w:val="000000"/>
-          <w:sz w:val="24"/>
-          <w:szCs w:val="24"/>
-        </w:rPr>
-        <w:t xml:space="preserve">) para el control interno general y COBIT (Control </w:t>
-      </w:r>
-      <w:proofErr w:type="spellStart"/>
-      <w:r>
-        <w:rPr>
-          <w:rFonts w:ascii="Arial" w:eastAsia="Arial" w:hAnsi="Arial" w:cs="Arial"/>
-          <w:color w:val="000000"/>
-          <w:sz w:val="24"/>
-          <w:szCs w:val="24"/>
-        </w:rPr>
-        <w:t>Objectives</w:t>
-      </w:r>
-      <w:proofErr w:type="spellEnd"/>
-      <w:r>
-        <w:rPr>
-          <w:rFonts w:ascii="Arial" w:eastAsia="Arial" w:hAnsi="Arial" w:cs="Arial"/>
-          <w:color w:val="000000"/>
-          <w:sz w:val="24"/>
-          <w:szCs w:val="24"/>
-        </w:rPr>
-        <w:t xml:space="preserve"> </w:t>
-      </w:r>
-      <w:proofErr w:type="spellStart"/>
-      <w:r>
-        <w:rPr>
-          <w:rFonts w:ascii="Arial" w:eastAsia="Arial" w:hAnsi="Arial" w:cs="Arial"/>
-          <w:color w:val="000000"/>
-          <w:sz w:val="24"/>
-          <w:szCs w:val="24"/>
-        </w:rPr>
-        <w:t>for</w:t>
-      </w:r>
-      <w:proofErr w:type="spellEnd"/>
-      <w:r>
-        <w:rPr>
-          <w:rFonts w:ascii="Arial" w:eastAsia="Arial" w:hAnsi="Arial" w:cs="Arial"/>
-          <w:color w:val="000000"/>
-          <w:sz w:val="24"/>
-          <w:szCs w:val="24"/>
-        </w:rPr>
-        <w:t xml:space="preserve"> </w:t>
-      </w:r>
-      <w:proofErr w:type="spellStart"/>
-      <w:r>
-        <w:rPr>
-          <w:rFonts w:ascii="Arial" w:eastAsia="Arial" w:hAnsi="Arial" w:cs="Arial"/>
-          <w:color w:val="000000"/>
-          <w:sz w:val="24"/>
-          <w:szCs w:val="24"/>
-        </w:rPr>
-        <w:t>Information</w:t>
-      </w:r>
-      <w:proofErr w:type="spellEnd"/>
-      <w:r>
-        <w:rPr>
-          <w:rFonts w:ascii="Arial" w:eastAsia="Arial" w:hAnsi="Arial" w:cs="Arial"/>
-          <w:color w:val="000000"/>
-          <w:sz w:val="24"/>
-          <w:szCs w:val="24"/>
-        </w:rPr>
-        <w:t xml:space="preserve"> and </w:t>
-      </w:r>
-      <w:proofErr w:type="spellStart"/>
-      <w:r>
-        <w:rPr>
-          <w:rFonts w:ascii="Arial" w:eastAsia="Arial" w:hAnsi="Arial" w:cs="Arial"/>
-          <w:color w:val="000000"/>
-          <w:sz w:val="24"/>
-          <w:szCs w:val="24"/>
-        </w:rPr>
-        <w:t>related</w:t>
-      </w:r>
-      <w:proofErr w:type="spellEnd"/>
-      <w:r>
-        <w:rPr>
-          <w:rFonts w:ascii="Arial" w:eastAsia="Arial" w:hAnsi="Arial" w:cs="Arial"/>
-          <w:color w:val="000000"/>
-          <w:sz w:val="24"/>
-          <w:szCs w:val="24"/>
-        </w:rPr>
-        <w:t xml:space="preserve"> </w:t>
-      </w:r>
-      <w:proofErr w:type="spellStart"/>
-      <w:r>
-        <w:rPr>
-          <w:rFonts w:ascii="Arial" w:eastAsia="Arial" w:hAnsi="Arial" w:cs="Arial"/>
-          <w:color w:val="000000"/>
-          <w:sz w:val="24"/>
-          <w:szCs w:val="24"/>
-        </w:rPr>
-        <w:t>Technology</w:t>
-      </w:r>
-      <w:proofErr w:type="spellEnd"/>
-      <w:r>
-        <w:rPr>
-          <w:rFonts w:ascii="Arial" w:eastAsia="Arial" w:hAnsi="Arial" w:cs="Arial"/>
-          <w:color w:val="000000"/>
-          <w:sz w:val="24"/>
-          <w:szCs w:val="24"/>
-        </w:rPr>
-        <w:t>) para los objetivos de control específicos de TI.</w:t>
-      </w:r>
-    </w:p>
-    <w:p>
-      <w:pPr>
-        <w:pBdr>
-          <w:top w:val="nil"/>
-          <w:left w:val="nil"/>
-          <w:bottom w:val="nil"/>
-          <w:right w:val="nil"/>
-          <w:between w:val="nil"/>
-        </w:pBdr>
-        <w:spacing w:after="0"/>
-        <w:ind w:left="1440"/>
-        <w:jc w:val="both"/>
-        <w:rPr>
-          <w:rFonts w:ascii="Arial" w:eastAsia="Arial" w:hAnsi="Arial" w:cs="Arial"/>
-          <w:color w:val="000000"/>
-          <w:sz w:val="24"/>
-          <w:szCs w:val="24"/>
-        </w:rPr>
-      </w:pPr>
-    </w:p>
-    <w:p>
-      <w:pPr>
-        <w:pBdr>
-          <w:top w:val="nil"/>
-          <w:left w:val="nil"/>
-          <w:bottom w:val="nil"/>
-          <w:right w:val="nil"/>
-          <w:between w:val="nil"/>
-        </w:pBdr>
-        <w:spacing w:after="0"/>
-        <w:ind w:left="1440"/>
-        <w:jc w:val="both"/>
-        <w:rPr>
-          <w:rFonts w:ascii="Arial" w:eastAsia="Arial" w:hAnsi="Arial" w:cs="Arial"/>
-          <w:color w:val="000000"/>
-          <w:sz w:val="24"/>
-          <w:szCs w:val="24"/>
-        </w:rPr>
-      </w:pPr>
-      <w:r>
-        <w:rPr>
-          <w:rFonts w:ascii="Arial" w:eastAsia="Arial" w:hAnsi="Arial" w:cs="Arial"/>
-          <w:color w:val="000000"/>
-          <w:sz w:val="24"/>
-          <w:szCs w:val="24"/>
-        </w:rPr>
-        <w:lastRenderedPageBreak/>
-        <w:t>Estructura por Fases de Auditoría: Organiza el contenido siguiendo el ciclo lógico y universal de una auditoría (Planeación -&gt; Ejecución -&gt; Informe), detallando actividades, responsables y productos esperados en cada etapa.</w:t>
-      </w:r>
+    </w:p>
+    <w:p>
+      <w:pPr>
+        <w:pBdr>
+          <w:top w:val="nil"/>
+          <w:left w:val="nil"/>
+          <w:bottom w:val="nil"/>
+          <w:right w:val="nil"/>
+          <w:between w:val="nil"/>
+        </w:pBdr>
+        <w:spacing w:after="0"/>
+        <w:ind w:left="1440"/>
+        <w:jc w:val="both"/>
+        <w:rPr>
+          <w:rFonts w:ascii="Arial" w:eastAsia="Arial" w:hAnsi="Arial" w:cs="Arial"/>
+          <w:color w:val="000000"/>
+          <w:sz w:val="24"/>
+          <w:szCs w:val="24"/>
+        </w:rPr>
+      </w:pPr>
+      <w:r>
+        <w:rPr>
+          <w:rFonts w:ascii="Arial" w:eastAsia="Arial" w:hAnsi="Arial" w:cs="Arial"/>
+          <w:color w:val="000000"/>
+          <w:sz w:val="24"/>
+          <w:szCs w:val="24"/>
+        </w:rPr>
+        <w:t>La metodología descrita es bastante estructurada y se divide por áreas de evaluación. Primero, para la Dirección de Informática, se basa en solicitar los estándares actuales, aplicar cuestionarios al personal y analizar la información obtenida. Segundo, para los sistemas, implica revisar la documentación técnica y de usuario, analizar el flujo de datos, verificar controles de seguridad (lógica y física) y realizar entrevistas directas con los usuarios para contrastar los requerimientos teóricos contra la realidad operativa. Tercero, para los equipos, requiere revisar contratos (compra, mantenimiento, seguros), aplicar cuestionarios sobre el uso de recursos y realizar visitas técnicas de inspección. Todo este proceso metódico culmina con el cruce de datos para estructurar un informe final con hallazgos, conclusiones y recomendaciones</w:t>
+      </w:r>
+    </w:p>
+    <w:p>
+      <w:pPr>
+        <w:pBdr>
+          <w:top w:val="nil"/>
+          <w:left w:val="nil"/>
+          <w:bottom w:val="nil"/>
+          <w:right w:val="nil"/>
+          <w:between w:val="nil"/>
+        </w:pBdr>
+        <w:spacing w:after="0"/>
+        <w:ind w:left="1440"/>
+        <w:jc w:val="both"/>
+        <w:rPr>
+          <w:rFonts w:ascii="Arial" w:eastAsia="Arial" w:hAnsi="Arial" w:cs="Arial"/>
+          <w:color w:val="000000"/>
+          <w:sz w:val="24"/>
+          <w:szCs w:val="24"/>
+        </w:rPr>
+      </w:pPr>
     </w:p>
     <w:p>
       <w:pPr>
@@ -902,6 +577,7 @@
           <w:sz w:val="24"/>
           <w:szCs w:val="24"/>
         </w:rPr>
+        <w:lastRenderedPageBreak/>
         <w:t>QUE INSUMOS LES PUEDEN SERVIR PARA EL CASO DE SU TRABAJO FINAL DE CURSO</w:t>
       </w:r>
     </w:p>
@@ -935,121 +611,70 @@
           <w:between w:val="nil"/>
         </w:pBdr>
         <w:spacing w:after="0"/>
-        <w:ind w:left="1080"/>
-        <w:jc w:val="both"/>
-        <w:rPr>
-          <w:rFonts w:ascii="Arial" w:eastAsia="Arial" w:hAnsi="Arial" w:cs="Arial"/>
-          <w:color w:val="000000"/>
-          <w:sz w:val="24"/>
-          <w:szCs w:val="24"/>
-        </w:rPr>
-      </w:pPr>
-      <w:r>
-        <w:rPr>
-          <w:rFonts w:ascii="Arial" w:eastAsia="Arial" w:hAnsi="Arial" w:cs="Arial"/>
-          <w:color w:val="000000"/>
-          <w:sz w:val="24"/>
-          <w:szCs w:val="24"/>
-        </w:rPr>
-        <w:t>Listas de Verificación de Planeación (Cap. XXVII, Sección 2): La guía detallada sobre qué información solicitar (Administración, Sistemas, Seguridad, Desarrollo). Esto sirve para elaborar la Carta de Requerimientos de Información Inicial.</w:t>
-      </w:r>
-    </w:p>
-    <w:p>
-      <w:pPr>
-        <w:pBdr>
-          <w:top w:val="nil"/>
-          <w:left w:val="nil"/>
-          <w:bottom w:val="nil"/>
-          <w:right w:val="nil"/>
-          <w:between w:val="nil"/>
-        </w:pBdr>
-        <w:spacing w:after="0"/>
-        <w:ind w:left="1080"/>
-        <w:jc w:val="both"/>
-        <w:rPr>
-          <w:rFonts w:ascii="Arial" w:eastAsia="Arial" w:hAnsi="Arial" w:cs="Arial"/>
-          <w:color w:val="000000"/>
-          <w:sz w:val="24"/>
-          <w:szCs w:val="24"/>
-        </w:rPr>
-      </w:pPr>
-    </w:p>
-    <w:p>
-      <w:pPr>
-        <w:pBdr>
-          <w:top w:val="nil"/>
-          <w:left w:val="nil"/>
-          <w:bottom w:val="nil"/>
-          <w:right w:val="nil"/>
-          <w:between w:val="nil"/>
-        </w:pBdr>
-        <w:spacing w:after="0"/>
-        <w:ind w:left="1080"/>
-        <w:jc w:val="both"/>
-        <w:rPr>
-          <w:rFonts w:ascii="Arial" w:eastAsia="Arial" w:hAnsi="Arial" w:cs="Arial"/>
-          <w:color w:val="000000"/>
-          <w:sz w:val="24"/>
-          <w:szCs w:val="24"/>
-        </w:rPr>
-      </w:pPr>
-      <w:r>
-        <w:rPr>
-          <w:rFonts w:ascii="Arial" w:eastAsia="Arial" w:hAnsi="Arial" w:cs="Arial"/>
-          <w:color w:val="000000"/>
-          <w:sz w:val="24"/>
-          <w:szCs w:val="24"/>
-        </w:rPr>
-        <w:t>Modelos de Programas de Auditoría (Anexo 2): Especialmente los programas de Evaluación del diseño lógico y Verificación de la seguridad física, que sirven como guía para planificar las pruebas sustantivas y de cumplimiento.</w:t>
-      </w:r>
-    </w:p>
-    <w:p>
-      <w:pPr>
-        <w:pBdr>
-          <w:top w:val="nil"/>
-          <w:left w:val="nil"/>
-          <w:bottom w:val="nil"/>
-          <w:right w:val="nil"/>
-          <w:between w:val="nil"/>
-        </w:pBdr>
-        <w:spacing w:after="0"/>
-        <w:ind w:left="1080"/>
-        <w:jc w:val="both"/>
-        <w:rPr>
-          <w:rFonts w:ascii="Arial" w:eastAsia="Arial" w:hAnsi="Arial" w:cs="Arial"/>
-          <w:color w:val="000000"/>
-          <w:sz w:val="24"/>
-          <w:szCs w:val="24"/>
-        </w:rPr>
-      </w:pPr>
-    </w:p>
-    <w:p>
-      <w:pPr>
-        <w:pBdr>
-          <w:top w:val="nil"/>
-          <w:left w:val="nil"/>
-          <w:bottom w:val="nil"/>
-          <w:right w:val="nil"/>
-          <w:between w:val="nil"/>
-        </w:pBdr>
-        <w:spacing w:after="0"/>
-        <w:ind w:left="1080"/>
-        <w:jc w:val="both"/>
-        <w:rPr>
-          <w:rFonts w:ascii="Arial" w:eastAsia="Arial" w:hAnsi="Arial" w:cs="Arial"/>
-          <w:color w:val="000000"/>
-          <w:sz w:val="24"/>
-          <w:szCs w:val="24"/>
-        </w:rPr>
-      </w:pPr>
-      <w:r>
-        <w:rPr>
-          <w:rFonts w:ascii="Arial" w:eastAsia="Arial" w:hAnsi="Arial" w:cs="Arial"/>
-          <w:color w:val="000000"/>
-          <w:sz w:val="24"/>
-          <w:szCs w:val="24"/>
-        </w:rPr>
-        <w:t>Estructura del Informe (Cap. XXIX): Proporciona el índice y contenido mínimo obligatorio para redactar el informe final del trabajo, asegurando que cumple con un formato profesional.</w:t>
+        <w:ind w:left="1440"/>
+        <w:jc w:val="both"/>
+        <w:rPr>
+          <w:rFonts w:ascii="Arial" w:eastAsia="Arial" w:hAnsi="Arial" w:cs="Arial"/>
+          <w:color w:val="000000"/>
+          <w:sz w:val="24"/>
+          <w:szCs w:val="24"/>
+        </w:rPr>
+      </w:pPr>
+      <w:r>
+        <w:rPr>
+          <w:rFonts w:ascii="Arial" w:eastAsia="Arial" w:hAnsi="Arial" w:cs="Arial"/>
+          <w:color w:val="000000"/>
+          <w:sz w:val="24"/>
+          <w:szCs w:val="24"/>
+        </w:rPr>
+        <w:t>El Reporte Final de Auditoría y la Ficha de evaluación del control interno nos dan la estructura exacta de cómo debemos documentar y presentar los resultados formalmente.</w:t>
+      </w:r>
+    </w:p>
+    <w:p>
+      <w:pPr>
+        <w:pBdr>
+          <w:top w:val="nil"/>
+          <w:left w:val="nil"/>
+          <w:bottom w:val="nil"/>
+          <w:right w:val="nil"/>
+          <w:between w:val="nil"/>
+        </w:pBdr>
+        <w:spacing w:after="0"/>
+        <w:ind w:left="1440"/>
+        <w:jc w:val="both"/>
+        <w:rPr>
+          <w:rFonts w:ascii="Arial" w:eastAsia="Arial" w:hAnsi="Arial" w:cs="Arial"/>
+          <w:color w:val="000000"/>
+          <w:sz w:val="24"/>
+          <w:szCs w:val="24"/>
+        </w:rPr>
+      </w:pPr>
+      <w:r>
+        <w:rPr>
+          <w:rFonts w:ascii="Arial" w:eastAsia="Arial" w:hAnsi="Arial" w:cs="Arial"/>
+          <w:color w:val="000000"/>
+          <w:sz w:val="24"/>
+          <w:szCs w:val="24"/>
+        </w:rPr>
+        <w:t xml:space="preserve">También, encontramos, </w:t>
+      </w:r>
+      <w:r>
+        <w:rPr>
+          <w:rFonts w:ascii="Arial" w:eastAsia="Arial" w:hAnsi="Arial" w:cs="Arial"/>
+          <w:color w:val="000000"/>
+          <w:sz w:val="24"/>
+          <w:szCs w:val="24"/>
+        </w:rPr>
+        <w:t>La matriz del Plan de acción para la implementación de COBIT</w:t>
+      </w:r>
+      <w:r>
+        <w:rPr>
+          <w:rFonts w:ascii="Arial" w:eastAsia="Arial" w:hAnsi="Arial" w:cs="Arial"/>
+          <w:color w:val="000000"/>
+          <w:sz w:val="24"/>
+          <w:szCs w:val="24"/>
+        </w:rPr>
+        <w:t>.</w:t>
       </w:r>
     </w:p>
     <w:p>
@@ -1192,23 +817,496 @@
           <w:between w:val="nil"/>
         </w:pBdr>
         <w:spacing w:after="0"/>
-        <w:ind w:left="1440"/>
-        <w:jc w:val="both"/>
-        <w:rPr>
-          <w:rFonts w:ascii="Arial" w:eastAsia="Arial" w:hAnsi="Arial" w:cs="Arial"/>
-          <w:color w:val="000000"/>
-          <w:sz w:val="24"/>
-          <w:szCs w:val="24"/>
-        </w:rPr>
-      </w:pPr>
-      <w:r>
-        <w:rPr>
-          <w:rFonts w:ascii="Arial" w:eastAsia="Arial" w:hAnsi="Arial" w:cs="Arial"/>
-          <w:color w:val="000000"/>
-          <w:sz w:val="24"/>
-          <w:szCs w:val="24"/>
-        </w:rPr>
-        <w:t xml:space="preserve">El documento establece una metodología basada en un proceso de tres fases, las cuales son planeación, ejecución e informe, tal como se detalla en el Capítulo XXVI, sección 4. En cuanto a las técnicas manuales, se identifican diversas herramientas como los cuestionarios o </w:t>
+        <w:jc w:val="both"/>
+        <w:rPr>
+          <w:rFonts w:ascii="Arial" w:eastAsia="Arial" w:hAnsi="Arial" w:cs="Arial"/>
+          <w:color w:val="000000"/>
+          <w:sz w:val="24"/>
+          <w:szCs w:val="24"/>
+          <w:lang w:val="es-US"/>
+        </w:rPr>
+      </w:pPr>
+    </w:p>
+    <w:p>
+      <w:pPr>
+        <w:pBdr>
+          <w:top w:val="nil"/>
+          <w:left w:val="nil"/>
+          <w:bottom w:val="nil"/>
+          <w:right w:val="nil"/>
+          <w:between w:val="nil"/>
+        </w:pBdr>
+        <w:spacing w:after="0"/>
+        <w:ind w:left="1080"/>
+        <w:jc w:val="both"/>
+        <w:rPr>
+          <w:rFonts w:ascii="Arial" w:eastAsia="Arial" w:hAnsi="Arial" w:cs="Arial"/>
+          <w:b/>
+          <w:bCs/>
+          <w:color w:val="000000"/>
+          <w:sz w:val="24"/>
+          <w:szCs w:val="24"/>
+        </w:rPr>
+      </w:pPr>
+      <w:r>
+        <w:rPr>
+          <w:rFonts w:ascii="Arial" w:eastAsia="Arial" w:hAnsi="Arial" w:cs="Arial"/>
+          <w:b/>
+          <w:bCs/>
+          <w:color w:val="000000"/>
+          <w:sz w:val="24"/>
+          <w:szCs w:val="24"/>
+        </w:rPr>
+        <w:t>Metodologías</w:t>
+      </w:r>
+    </w:p>
+    <w:p>
+      <w:pPr>
+        <w:pBdr>
+          <w:top w:val="nil"/>
+          <w:left w:val="nil"/>
+          <w:bottom w:val="nil"/>
+          <w:right w:val="nil"/>
+          <w:between w:val="nil"/>
+        </w:pBdr>
+        <w:spacing w:after="0"/>
+        <w:ind w:left="1080"/>
+        <w:jc w:val="both"/>
+        <w:rPr>
+          <w:rFonts w:ascii="Arial" w:eastAsia="Arial" w:hAnsi="Arial" w:cs="Arial"/>
+          <w:color w:val="000000"/>
+          <w:sz w:val="24"/>
+          <w:szCs w:val="24"/>
+        </w:rPr>
+      </w:pPr>
+    </w:p>
+    <w:p>
+      <w:pPr>
+        <w:pBdr>
+          <w:top w:val="nil"/>
+          <w:left w:val="nil"/>
+          <w:bottom w:val="nil"/>
+          <w:right w:val="nil"/>
+          <w:between w:val="nil"/>
+        </w:pBdr>
+        <w:spacing w:after="0"/>
+        <w:ind w:left="1080"/>
+        <w:jc w:val="both"/>
+        <w:rPr>
+          <w:rFonts w:ascii="Arial" w:eastAsia="Arial" w:hAnsi="Arial" w:cs="Arial"/>
+          <w:color w:val="000000"/>
+          <w:sz w:val="24"/>
+          <w:szCs w:val="24"/>
+        </w:rPr>
+      </w:pPr>
+      <w:r>
+        <w:rPr>
+          <w:rFonts w:ascii="Arial" w:eastAsia="Arial" w:hAnsi="Arial" w:cs="Arial"/>
+          <w:color w:val="000000"/>
+          <w:sz w:val="24"/>
+          <w:szCs w:val="24"/>
+        </w:rPr>
+        <w:t>Implementación de la guía genérica COBIT para evaluar los objetivos de control, el modelo de madurez y los riesgos de los procesos informáticos.</w:t>
+      </w:r>
+    </w:p>
+    <w:p>
+      <w:pPr>
+        <w:pBdr>
+          <w:top w:val="nil"/>
+          <w:left w:val="nil"/>
+          <w:bottom w:val="nil"/>
+          <w:right w:val="nil"/>
+          <w:between w:val="nil"/>
+        </w:pBdr>
+        <w:spacing w:after="0"/>
+        <w:ind w:left="1080"/>
+        <w:jc w:val="both"/>
+        <w:rPr>
+          <w:rFonts w:ascii="Arial" w:eastAsia="Arial" w:hAnsi="Arial" w:cs="Arial"/>
+          <w:color w:val="000000"/>
+          <w:sz w:val="24"/>
+          <w:szCs w:val="24"/>
+        </w:rPr>
+      </w:pPr>
+    </w:p>
+    <w:p>
+      <w:pPr>
+        <w:pBdr>
+          <w:top w:val="nil"/>
+          <w:left w:val="nil"/>
+          <w:bottom w:val="nil"/>
+          <w:right w:val="nil"/>
+          <w:between w:val="nil"/>
+        </w:pBdr>
+        <w:spacing w:after="0"/>
+        <w:ind w:left="1080"/>
+        <w:jc w:val="both"/>
+        <w:rPr>
+          <w:rFonts w:ascii="Arial" w:eastAsia="Arial" w:hAnsi="Arial" w:cs="Arial"/>
+          <w:color w:val="000000"/>
+          <w:sz w:val="24"/>
+          <w:szCs w:val="24"/>
+        </w:rPr>
+      </w:pPr>
+      <w:r>
+        <w:rPr>
+          <w:rFonts w:ascii="Arial" w:eastAsia="Arial" w:hAnsi="Arial" w:cs="Arial"/>
+          <w:color w:val="000000"/>
+          <w:sz w:val="24"/>
+          <w:szCs w:val="24"/>
+        </w:rPr>
+        <w:t>Administración por Proyectos, utilizada específicamente como enfoque para auditar y controlar el avance en el desarrollo e implementación de nuevos sistemas.</w:t>
+      </w:r>
+    </w:p>
+    <w:p>
+      <w:pPr>
+        <w:pBdr>
+          <w:top w:val="nil"/>
+          <w:left w:val="nil"/>
+          <w:bottom w:val="nil"/>
+          <w:right w:val="nil"/>
+          <w:between w:val="nil"/>
+        </w:pBdr>
+        <w:spacing w:after="0"/>
+        <w:ind w:left="1080"/>
+        <w:jc w:val="both"/>
+        <w:rPr>
+          <w:rFonts w:ascii="Arial" w:eastAsia="Arial" w:hAnsi="Arial" w:cs="Arial"/>
+          <w:color w:val="000000"/>
+          <w:sz w:val="24"/>
+          <w:szCs w:val="24"/>
+        </w:rPr>
+      </w:pPr>
+    </w:p>
+    <w:p>
+      <w:pPr>
+        <w:pBdr>
+          <w:top w:val="nil"/>
+          <w:left w:val="nil"/>
+          <w:bottom w:val="nil"/>
+          <w:right w:val="nil"/>
+          <w:between w:val="nil"/>
+        </w:pBdr>
+        <w:spacing w:after="0"/>
+        <w:ind w:left="1080"/>
+        <w:jc w:val="both"/>
+        <w:rPr>
+          <w:rFonts w:ascii="Arial" w:eastAsia="Arial" w:hAnsi="Arial" w:cs="Arial"/>
+          <w:b/>
+          <w:bCs/>
+          <w:color w:val="000000"/>
+          <w:sz w:val="24"/>
+          <w:szCs w:val="24"/>
+        </w:rPr>
+      </w:pPr>
+      <w:r>
+        <w:rPr>
+          <w:rFonts w:ascii="Arial" w:eastAsia="Arial" w:hAnsi="Arial" w:cs="Arial"/>
+          <w:b/>
+          <w:bCs/>
+          <w:color w:val="000000"/>
+          <w:sz w:val="24"/>
+          <w:szCs w:val="24"/>
+        </w:rPr>
+        <w:t>Técnicas</w:t>
+      </w:r>
+    </w:p>
+    <w:p>
+      <w:pPr>
+        <w:pBdr>
+          <w:top w:val="nil"/>
+          <w:left w:val="nil"/>
+          <w:bottom w:val="nil"/>
+          <w:right w:val="nil"/>
+          <w:between w:val="nil"/>
+        </w:pBdr>
+        <w:spacing w:after="0"/>
+        <w:ind w:left="1080"/>
+        <w:jc w:val="both"/>
+        <w:rPr>
+          <w:rFonts w:ascii="Arial" w:eastAsia="Arial" w:hAnsi="Arial" w:cs="Arial"/>
+          <w:color w:val="000000"/>
+          <w:sz w:val="24"/>
+          <w:szCs w:val="24"/>
+        </w:rPr>
+      </w:pPr>
+    </w:p>
+    <w:p>
+      <w:pPr>
+        <w:pBdr>
+          <w:top w:val="nil"/>
+          <w:left w:val="nil"/>
+          <w:bottom w:val="nil"/>
+          <w:right w:val="nil"/>
+          <w:between w:val="nil"/>
+        </w:pBdr>
+        <w:spacing w:after="0"/>
+        <w:ind w:left="1080"/>
+        <w:jc w:val="both"/>
+        <w:rPr>
+          <w:rFonts w:ascii="Arial" w:eastAsia="Arial" w:hAnsi="Arial" w:cs="Arial"/>
+          <w:color w:val="000000"/>
+          <w:sz w:val="24"/>
+          <w:szCs w:val="24"/>
+        </w:rPr>
+      </w:pPr>
+      <w:r>
+        <w:rPr>
+          <w:rFonts w:ascii="Arial" w:eastAsia="Arial" w:hAnsi="Arial" w:cs="Arial"/>
+          <w:color w:val="000000"/>
+          <w:sz w:val="24"/>
+          <w:szCs w:val="24"/>
+        </w:rPr>
+        <w:t>Entrevistas dirigidas a usuarios directos e informantes clave para conocer su percepción real del servicio y validar el nivel de satisfacción.</w:t>
+      </w:r>
+    </w:p>
+    <w:p>
+      <w:pPr>
+        <w:pBdr>
+          <w:top w:val="nil"/>
+          <w:left w:val="nil"/>
+          <w:bottom w:val="nil"/>
+          <w:right w:val="nil"/>
+          <w:between w:val="nil"/>
+        </w:pBdr>
+        <w:spacing w:after="0"/>
+        <w:ind w:left="1080"/>
+        <w:jc w:val="both"/>
+        <w:rPr>
+          <w:rFonts w:ascii="Arial" w:eastAsia="Arial" w:hAnsi="Arial" w:cs="Arial"/>
+          <w:color w:val="000000"/>
+          <w:sz w:val="24"/>
+          <w:szCs w:val="24"/>
+        </w:rPr>
+      </w:pPr>
+    </w:p>
+    <w:p>
+      <w:pPr>
+        <w:pBdr>
+          <w:top w:val="nil"/>
+          <w:left w:val="nil"/>
+          <w:bottom w:val="nil"/>
+          <w:right w:val="nil"/>
+          <w:between w:val="nil"/>
+        </w:pBdr>
+        <w:spacing w:after="0"/>
+        <w:ind w:left="1080"/>
+        <w:jc w:val="both"/>
+        <w:rPr>
+          <w:rFonts w:ascii="Arial" w:eastAsia="Arial" w:hAnsi="Arial" w:cs="Arial"/>
+          <w:color w:val="000000"/>
+          <w:sz w:val="24"/>
+          <w:szCs w:val="24"/>
+        </w:rPr>
+      </w:pPr>
+      <w:r>
+        <w:rPr>
+          <w:rFonts w:ascii="Arial" w:eastAsia="Arial" w:hAnsi="Arial" w:cs="Arial"/>
+          <w:color w:val="000000"/>
+          <w:sz w:val="24"/>
+          <w:szCs w:val="24"/>
+        </w:rPr>
+        <w:t>Análisis documental mediante la revisión profunda de estudios de factibilidad, manuales de usuario, contratos de mantenimiento, pólizas de seguros y bitácoras de operación.</w:t>
+      </w:r>
+    </w:p>
+    <w:p>
+      <w:pPr>
+        <w:pBdr>
+          <w:top w:val="nil"/>
+          <w:left w:val="nil"/>
+          <w:bottom w:val="nil"/>
+          <w:right w:val="nil"/>
+          <w:between w:val="nil"/>
+        </w:pBdr>
+        <w:spacing w:after="0"/>
+        <w:ind w:left="1080"/>
+        <w:jc w:val="both"/>
+        <w:rPr>
+          <w:rFonts w:ascii="Arial" w:eastAsia="Arial" w:hAnsi="Arial" w:cs="Arial"/>
+          <w:color w:val="000000"/>
+          <w:sz w:val="24"/>
+          <w:szCs w:val="24"/>
+        </w:rPr>
+      </w:pPr>
+    </w:p>
+    <w:p>
+      <w:pPr>
+        <w:pBdr>
+          <w:top w:val="nil"/>
+          <w:left w:val="nil"/>
+          <w:bottom w:val="nil"/>
+          <w:right w:val="nil"/>
+          <w:between w:val="nil"/>
+        </w:pBdr>
+        <w:spacing w:after="0"/>
+        <w:ind w:left="1080"/>
+        <w:jc w:val="both"/>
+        <w:rPr>
+          <w:rFonts w:ascii="Arial" w:eastAsia="Arial" w:hAnsi="Arial" w:cs="Arial"/>
+          <w:color w:val="000000"/>
+          <w:sz w:val="24"/>
+          <w:szCs w:val="24"/>
+        </w:rPr>
+      </w:pPr>
+      <w:r>
+        <w:rPr>
+          <w:rFonts w:ascii="Arial" w:eastAsia="Arial" w:hAnsi="Arial" w:cs="Arial"/>
+          <w:color w:val="000000"/>
+          <w:sz w:val="24"/>
+          <w:szCs w:val="24"/>
+        </w:rPr>
+        <w:t>Inspección visual (visitas técnicas in situ) para comprobar la distribución, el estado del hardware, las instalaciones eléctricas y las medidas de seguridad perimetral y contra incendios.</w:t>
+      </w:r>
+    </w:p>
+    <w:p>
+      <w:pPr>
+        <w:pBdr>
+          <w:top w:val="nil"/>
+          <w:left w:val="nil"/>
+          <w:bottom w:val="nil"/>
+          <w:right w:val="nil"/>
+          <w:between w:val="nil"/>
+        </w:pBdr>
+        <w:spacing w:after="0"/>
+        <w:ind w:left="1080"/>
+        <w:jc w:val="both"/>
+        <w:rPr>
+          <w:rFonts w:ascii="Arial" w:eastAsia="Arial" w:hAnsi="Arial" w:cs="Arial"/>
+          <w:color w:val="000000"/>
+          <w:sz w:val="24"/>
+          <w:szCs w:val="24"/>
+        </w:rPr>
+      </w:pPr>
+    </w:p>
+    <w:p>
+      <w:pPr>
+        <w:pBdr>
+          <w:top w:val="nil"/>
+          <w:left w:val="nil"/>
+          <w:bottom w:val="nil"/>
+          <w:right w:val="nil"/>
+          <w:between w:val="nil"/>
+        </w:pBdr>
+        <w:spacing w:after="0"/>
+        <w:ind w:left="1080"/>
+        <w:jc w:val="both"/>
+        <w:rPr>
+          <w:rFonts w:ascii="Arial" w:eastAsia="Arial" w:hAnsi="Arial" w:cs="Arial"/>
+          <w:color w:val="000000"/>
+          <w:sz w:val="24"/>
+          <w:szCs w:val="24"/>
+        </w:rPr>
+      </w:pPr>
+      <w:r>
+        <w:rPr>
+          <w:rFonts w:ascii="Arial" w:eastAsia="Arial" w:hAnsi="Arial" w:cs="Arial"/>
+          <w:color w:val="000000"/>
+          <w:sz w:val="24"/>
+          <w:szCs w:val="24"/>
+        </w:rPr>
+        <w:t>Muestreo selectivo aplicado a la documentación de las aplicaciones y a las salidas (reportes) generadas por los sistemas.</w:t>
+      </w:r>
+    </w:p>
+    <w:p>
+      <w:pPr>
+        <w:pBdr>
+          <w:top w:val="nil"/>
+          <w:left w:val="nil"/>
+          <w:bottom w:val="nil"/>
+          <w:right w:val="nil"/>
+          <w:between w:val="nil"/>
+        </w:pBdr>
+        <w:spacing w:after="0"/>
+        <w:ind w:left="1080"/>
+        <w:jc w:val="both"/>
+        <w:rPr>
+          <w:rFonts w:ascii="Arial" w:eastAsia="Arial" w:hAnsi="Arial" w:cs="Arial"/>
+          <w:color w:val="000000"/>
+          <w:sz w:val="24"/>
+          <w:szCs w:val="24"/>
+        </w:rPr>
+      </w:pPr>
+    </w:p>
+    <w:p>
+      <w:pPr>
+        <w:pBdr>
+          <w:top w:val="nil"/>
+          <w:left w:val="nil"/>
+          <w:bottom w:val="nil"/>
+          <w:right w:val="nil"/>
+          <w:between w:val="nil"/>
+        </w:pBdr>
+        <w:spacing w:after="0"/>
+        <w:ind w:left="1080"/>
+        <w:jc w:val="both"/>
+        <w:rPr>
+          <w:rFonts w:ascii="Arial" w:eastAsia="Arial" w:hAnsi="Arial" w:cs="Arial"/>
+          <w:b/>
+          <w:bCs/>
+          <w:color w:val="000000"/>
+          <w:sz w:val="24"/>
+          <w:szCs w:val="24"/>
+        </w:rPr>
+      </w:pPr>
+      <w:r>
+        <w:rPr>
+          <w:rFonts w:ascii="Arial" w:eastAsia="Arial" w:hAnsi="Arial" w:cs="Arial"/>
+          <w:b/>
+          <w:bCs/>
+          <w:color w:val="000000"/>
+          <w:sz w:val="24"/>
+          <w:szCs w:val="24"/>
+        </w:rPr>
+        <w:t>Instrumentos</w:t>
+      </w:r>
+    </w:p>
+    <w:p>
+      <w:pPr>
+        <w:pBdr>
+          <w:top w:val="nil"/>
+          <w:left w:val="nil"/>
+          <w:bottom w:val="nil"/>
+          <w:right w:val="nil"/>
+          <w:between w:val="nil"/>
+        </w:pBdr>
+        <w:spacing w:after="0"/>
+        <w:ind w:left="1080"/>
+        <w:jc w:val="both"/>
+        <w:rPr>
+          <w:rFonts w:ascii="Arial" w:eastAsia="Arial" w:hAnsi="Arial" w:cs="Arial"/>
+          <w:color w:val="000000"/>
+          <w:sz w:val="24"/>
+          <w:szCs w:val="24"/>
+        </w:rPr>
+      </w:pPr>
+    </w:p>
+    <w:p>
+      <w:pPr>
+        <w:pBdr>
+          <w:top w:val="nil"/>
+          <w:left w:val="nil"/>
+          <w:bottom w:val="nil"/>
+          <w:right w:val="nil"/>
+          <w:between w:val="nil"/>
+        </w:pBdr>
+        <w:spacing w:after="0"/>
+        <w:ind w:left="1080"/>
+        <w:jc w:val="both"/>
+        <w:rPr>
+          <w:rFonts w:ascii="Arial" w:eastAsia="Arial" w:hAnsi="Arial" w:cs="Arial"/>
+          <w:color w:val="000000"/>
+          <w:sz w:val="24"/>
+          <w:szCs w:val="24"/>
+        </w:rPr>
+      </w:pPr>
+      <w:r>
+        <w:rPr>
+          <w:rFonts w:ascii="Arial" w:eastAsia="Arial" w:hAnsi="Arial" w:cs="Arial"/>
+          <w:color w:val="000000"/>
+          <w:sz w:val="24"/>
+          <w:szCs w:val="24"/>
+        </w:rPr>
+        <w:t>Cuestionarios y listas de verificación (</w:t>
       </w:r>
       <w:proofErr w:type="spellStart"/>
       <w:r>
@@ -1218,7 +1316,7 @@
           <w:sz w:val="24"/>
           <w:szCs w:val="24"/>
         </w:rPr>
-        <w:t>checklist</w:t>
+        <w:t>checklists</w:t>
       </w:r>
       <w:proofErr w:type="spellEnd"/>
       <w:r>
@@ -1228,126 +1326,48 @@
           <w:sz w:val="24"/>
           <w:szCs w:val="24"/>
         </w:rPr>
-        <w:t>, utilizados mediante evaluaciones binarias y de rango (Cap. XXVIII, Sec. 1.1 c), así como las entrevistas, que se apoyan en la interacción y relaciones personales con el auditado (Cap. XXVIII, Sec. 1.1 b). También se incluye el análisis de código o comparación, que permite el mapeo y rastreo de programas (Cap. XXVIII, Sec. 1.1 e).</w:t>
-      </w:r>
-    </w:p>
-    <w:p>
-      <w:pPr>
-        <w:pBdr>
-          <w:top w:val="nil"/>
-          <w:left w:val="nil"/>
-          <w:bottom w:val="nil"/>
-          <w:right w:val="nil"/>
-          <w:between w:val="nil"/>
-        </w:pBdr>
-        <w:spacing w:after="0"/>
-        <w:ind w:left="1440"/>
-        <w:jc w:val="both"/>
-        <w:rPr>
-          <w:rFonts w:ascii="Arial" w:eastAsia="Arial" w:hAnsi="Arial" w:cs="Arial"/>
-          <w:color w:val="000000"/>
-          <w:sz w:val="24"/>
-          <w:szCs w:val="24"/>
-        </w:rPr>
-      </w:pPr>
-    </w:p>
-    <w:p>
-      <w:pPr>
-        <w:pBdr>
-          <w:top w:val="nil"/>
-          <w:left w:val="nil"/>
-          <w:bottom w:val="nil"/>
-          <w:right w:val="nil"/>
-          <w:between w:val="nil"/>
-        </w:pBdr>
-        <w:spacing w:after="0"/>
-        <w:ind w:left="1440"/>
-        <w:jc w:val="both"/>
-        <w:rPr>
-          <w:rFonts w:ascii="Arial" w:eastAsia="Arial" w:hAnsi="Arial" w:cs="Arial"/>
-          <w:color w:val="000000"/>
-          <w:sz w:val="24"/>
-          <w:szCs w:val="24"/>
-        </w:rPr>
-      </w:pPr>
-      <w:r>
-        <w:rPr>
-          <w:rFonts w:ascii="Arial" w:eastAsia="Arial" w:hAnsi="Arial" w:cs="Arial"/>
-          <w:color w:val="000000"/>
-          <w:sz w:val="24"/>
-          <w:szCs w:val="24"/>
-        </w:rPr>
-        <w:t>Por otro lado, el documento contempla técnicas asistidas por computadora (</w:t>
-      </w:r>
-      <w:proofErr w:type="spellStart"/>
-      <w:r>
-        <w:rPr>
-          <w:rFonts w:ascii="Arial" w:eastAsia="Arial" w:hAnsi="Arial" w:cs="Arial"/>
-          <w:color w:val="000000"/>
-          <w:sz w:val="24"/>
-          <w:szCs w:val="24"/>
-        </w:rPr>
-        <w:t>CAATs</w:t>
-      </w:r>
-      <w:proofErr w:type="spellEnd"/>
-      <w:r>
-        <w:rPr>
-          <w:rFonts w:ascii="Arial" w:eastAsia="Arial" w:hAnsi="Arial" w:cs="Arial"/>
-          <w:color w:val="000000"/>
-          <w:sz w:val="24"/>
-          <w:szCs w:val="24"/>
-        </w:rPr>
-        <w:t>), entre las que se encuentran los datos de prueba, utilizados mediante lotes para validar rutinas de edición (Cap. XXVIII, Sec. 1.2 c), el uso de software de auditoría como IDEA, que facilita el análisis y la extracción interactiva de datos (Cap. XXVIII, Sec. 1.2 f), y la simulación paralela, que consiste en procesar datos utilizando un programa del auditor en comparación con el programa real (Cap. XXVIII, Sec. 1.1 j).</w:t>
-      </w:r>
-    </w:p>
-    <w:p>
-      <w:pPr>
-        <w:pBdr>
-          <w:top w:val="nil"/>
-          <w:left w:val="nil"/>
-          <w:bottom w:val="nil"/>
-          <w:right w:val="nil"/>
-          <w:between w:val="nil"/>
-        </w:pBdr>
-        <w:spacing w:after="0"/>
-        <w:ind w:left="1440"/>
-        <w:jc w:val="both"/>
-        <w:rPr>
-          <w:rFonts w:ascii="Arial" w:eastAsia="Arial" w:hAnsi="Arial" w:cs="Arial"/>
-          <w:color w:val="000000"/>
-          <w:sz w:val="24"/>
-          <w:szCs w:val="24"/>
-        </w:rPr>
-      </w:pPr>
-    </w:p>
-    <w:p>
-      <w:pPr>
-        <w:pBdr>
-          <w:top w:val="nil"/>
-          <w:left w:val="nil"/>
-          <w:bottom w:val="nil"/>
-          <w:right w:val="nil"/>
-          <w:between w:val="nil"/>
-        </w:pBdr>
-        <w:spacing w:after="0"/>
-        <w:ind w:left="1440"/>
-        <w:jc w:val="both"/>
-        <w:rPr>
-          <w:rFonts w:ascii="Arial" w:eastAsia="Arial" w:hAnsi="Arial" w:cs="Arial"/>
-          <w:color w:val="000000"/>
-          <w:sz w:val="24"/>
-          <w:szCs w:val="24"/>
-        </w:rPr>
-      </w:pPr>
-      <w:r>
-        <w:rPr>
-          <w:rFonts w:ascii="Arial" w:eastAsia="Arial" w:hAnsi="Arial" w:cs="Arial"/>
-          <w:color w:val="000000"/>
-          <w:sz w:val="24"/>
-          <w:szCs w:val="24"/>
-        </w:rPr>
-        <w:t xml:space="preserve">Finalmente, se describen los instrumentos incluidos en los anexos, como el cuestionario de seguridad física, que contiene preguntas relacionadas con extintores, </w:t>
-      </w:r>
+        <w:t>) sumamente detallados, categorizados por áreas de dominio (redes, ofimática, bases de datos, seguridad física/lógica, desarrollo).</w:t>
+      </w:r>
+    </w:p>
+    <w:p>
+      <w:pPr>
+        <w:pBdr>
+          <w:top w:val="nil"/>
+          <w:left w:val="nil"/>
+          <w:bottom w:val="nil"/>
+          <w:right w:val="nil"/>
+          <w:between w:val="nil"/>
+        </w:pBdr>
+        <w:spacing w:after="0"/>
+        <w:ind w:left="1080"/>
+        <w:jc w:val="both"/>
+        <w:rPr>
+          <w:rFonts w:ascii="Arial" w:eastAsia="Arial" w:hAnsi="Arial" w:cs="Arial"/>
+          <w:color w:val="000000"/>
+          <w:sz w:val="24"/>
+          <w:szCs w:val="24"/>
+        </w:rPr>
+      </w:pPr>
+    </w:p>
+    <w:p>
+      <w:pPr>
+        <w:pBdr>
+          <w:top w:val="nil"/>
+          <w:left w:val="nil"/>
+          <w:bottom w:val="nil"/>
+          <w:right w:val="nil"/>
+          <w:between w:val="nil"/>
+        </w:pBdr>
+        <w:spacing w:after="0"/>
+        <w:ind w:left="1080"/>
+        <w:jc w:val="both"/>
+        <w:rPr>
+          <w:rFonts w:ascii="Arial" w:eastAsia="Arial" w:hAnsi="Arial" w:cs="Arial"/>
+          <w:color w:val="000000"/>
+          <w:sz w:val="24"/>
+          <w:szCs w:val="24"/>
+        </w:rPr>
+      </w:pPr>
       <w:r>
         <w:rPr>
           <w:rFonts w:ascii="Arial" w:eastAsia="Arial" w:hAnsi="Arial" w:cs="Arial"/>
@@ -1356,28 +1376,8 @@
           <w:szCs w:val="24"/>
         </w:rPr>
         <w:lastRenderedPageBreak/>
-        <w:t>alarmas y control de acceso (Anexo 1.11), y el programa de verificación de hardware, que establece procedimientos para evaluar el mantenimiento y los cambios en los equipos (Anexo 2.3).</w:t>
-      </w:r>
-    </w:p>
-    <w:p>
-      <w:pPr>
-        <w:pBdr>
-          <w:top w:val="nil"/>
-          <w:left w:val="nil"/>
-          <w:bottom w:val="nil"/>
-          <w:right w:val="nil"/>
-          <w:between w:val="nil"/>
-        </w:pBdr>
-        <w:spacing w:after="0"/>
-        <w:jc w:val="both"/>
-        <w:rPr>
-          <w:rFonts w:ascii="Arial" w:eastAsia="Arial" w:hAnsi="Arial" w:cs="Arial"/>
-          <w:color w:val="000000"/>
-          <w:sz w:val="24"/>
-          <w:szCs w:val="24"/>
-          <w:lang w:val="es-US"/>
-        </w:rPr>
-      </w:pPr>
+        <w:t>Tabla RACI utilizada para mapear e identificar claramente a los responsables de cada tarea y proceso dentro del departamento de TI.</w:t>
+      </w:r>
     </w:p>
     <w:p>
       <w:pPr>
@@ -1398,6 +1398,35 @@
           <w:szCs w:val="24"/>
         </w:rPr>
       </w:pPr>
+    </w:p>
+    <w:p>
+      <w:pPr>
+        <w:pBdr>
+          <w:top w:val="nil"/>
+          <w:left w:val="nil"/>
+          <w:bottom w:val="nil"/>
+          <w:right w:val="nil"/>
+          <w:between w:val="nil"/>
+        </w:pBdr>
+        <w:spacing w:after="0"/>
+        <w:ind w:left="1080"/>
+        <w:jc w:val="both"/>
+        <w:rPr>
+          <w:rFonts w:ascii="Arial" w:eastAsia="Arial" w:hAnsi="Arial" w:cs="Arial"/>
+          <w:color w:val="000000"/>
+          <w:sz w:val="24"/>
+          <w:szCs w:val="24"/>
+        </w:rPr>
+      </w:pPr>
+      <w:r>
+        <w:rPr>
+          <w:rFonts w:ascii="Arial" w:eastAsia="Arial" w:hAnsi="Arial" w:cs="Arial"/>
+          <w:color w:val="000000"/>
+          <w:sz w:val="24"/>
+          <w:szCs w:val="24"/>
+        </w:rPr>
+        <w:t>Fichas de evaluación de control interno diseñadas para documentar el nivel de riesgo, la importancia del hallazgo y la opinión/recomendación gerencial.</w:t>
+      </w:r>
     </w:p>
     <w:p>
       <w:pPr>
@@ -1713,27 +1742,7 @@
           <w:sz w:val="24"/>
           <w:szCs w:val="24"/>
         </w:rPr>
-        <w:t xml:space="preserve">Pistas de Auditoría (Cap. XXVIII, Sec. 3.3): El manual define claramente los datos mínimos que debe contener una pista de auditoría en un sistema automatizado (Identidad del usuario, tiempo de inicio/fin, intentos fallidos, recursos accedidos). Esto es fundamental para la </w:t>
-      </w:r>
-      <w:proofErr w:type="spellStart"/>
-      <w:r>
-        <w:rPr>
-          <w:rFonts w:ascii="Arial" w:eastAsia="Arial" w:hAnsi="Arial" w:cs="Arial"/>
-          <w:color w:val="000000"/>
-          <w:sz w:val="24"/>
-          <w:szCs w:val="24"/>
-        </w:rPr>
-        <w:t>auditabilidad</w:t>
-      </w:r>
-      <w:proofErr w:type="spellEnd"/>
-      <w:r>
-        <w:rPr>
-          <w:rFonts w:ascii="Arial" w:eastAsia="Arial" w:hAnsi="Arial" w:cs="Arial"/>
-          <w:color w:val="000000"/>
-          <w:sz w:val="24"/>
-          <w:szCs w:val="24"/>
-        </w:rPr>
-        <w:t xml:space="preserve"> de las transacciones electrónicas en un entorno sin papel.</w:t>
+        <w:t>Pistas de Auditoría (Cap. XXVIII, Sec. 3.3): El manual define claramente los datos mínimos que debe contener una pista de auditoría en un sistema automatizado (Identidad del usuario, tiempo de inicio/fin, intentos fallidos, recursos accedidos). Esto es fundamental para la auditabilidad de las transacciones electrónicas en un entorno sin papel.</w:t>
       </w:r>
     </w:p>
     <w:p>
@@ -2294,25 +2303,7 @@
           <w:sz w:val="24"/>
           <w:szCs w:val="24"/>
         </w:rPr>
-        <w:t>Cumplimiento de contratos con terceros (</w:t>
-      </w:r>
-      <w:proofErr w:type="spellStart"/>
-      <w:r>
-        <w:rPr>
-          <w:rFonts w:ascii="Arial" w:eastAsia="Arial" w:hAnsi="Arial" w:cs="Arial"/>
-          <w:sz w:val="24"/>
-          <w:szCs w:val="24"/>
-        </w:rPr>
-        <w:t>Outsourcing</w:t>
-      </w:r>
-      <w:proofErr w:type="spellEnd"/>
-      <w:r>
-        <w:rPr>
-          <w:rFonts w:ascii="Arial" w:eastAsia="Arial" w:hAnsi="Arial" w:cs="Arial"/>
-          <w:sz w:val="24"/>
-          <w:szCs w:val="24"/>
-        </w:rPr>
-        <w:t>).</w:t>
+        <w:t>Cumplimiento de contratos con terceros (Outsourcing).</w:t>
       </w:r>
     </w:p>
     <w:p>
@@ -2775,27 +2766,7 @@
           <w:sz w:val="24"/>
           <w:szCs w:val="24"/>
         </w:rPr>
-        <w:t xml:space="preserve">Metodología Explícita: Al exigir que se describan las técnicas y criterios utilizados, el informe gana en transparencia y </w:t>
-      </w:r>
-      <w:proofErr w:type="spellStart"/>
-      <w:r>
-        <w:rPr>
-          <w:rFonts w:ascii="Arial" w:eastAsia="Arial" w:hAnsi="Arial" w:cs="Arial"/>
-          <w:color w:val="000000"/>
-          <w:sz w:val="24"/>
-          <w:szCs w:val="24"/>
-        </w:rPr>
-        <w:t>replicabilidad</w:t>
-      </w:r>
-      <w:proofErr w:type="spellEnd"/>
-      <w:r>
-        <w:rPr>
-          <w:rFonts w:ascii="Arial" w:eastAsia="Arial" w:hAnsi="Arial" w:cs="Arial"/>
-          <w:color w:val="000000"/>
-          <w:sz w:val="24"/>
-          <w:szCs w:val="24"/>
-        </w:rPr>
-        <w:t>. El lector entiende cómo se llegó a esa conclusión.</w:t>
+        <w:t>Metodología Explícita: Al exigir que se describan las técnicas y criterios utilizados, el informe gana en transparencia y replicabilidad. El lector entiende cómo se llegó a esa conclusión.</w:t>
       </w:r>
     </w:p>
     <w:p>
@@ -3040,8 +3011,6 @@
           <w:szCs w:val="24"/>
         </w:rPr>
       </w:pPr>
-      <w:bookmarkStart w:id="0" w:name="_GoBack"/>
-      <w:bookmarkEnd w:id="0"/>
     </w:p>
     <w:p>
       <w:pPr>
@@ -3582,7 +3551,6 @@
               </w:rPr>
               <w:t>Las salidas ya no son solo papel. Se debe evaluar la seguridad en la </w:t>
             </w:r>
-            <w:proofErr w:type="spellStart"/>
             <w:r>
               <w:rPr>
                 <w:rFonts w:ascii="Arial" w:eastAsia="Arial" w:hAnsi="Arial" w:cs="Arial"/>
@@ -3592,19 +3560,7 @@
                 <w:szCs w:val="24"/>
                 <w:lang w:val="es-US"/>
               </w:rPr>
-              <w:t>exfiltración</w:t>
-            </w:r>
-            <w:proofErr w:type="spellEnd"/>
-            <w:r>
-              <w:rPr>
-                <w:rFonts w:ascii="Arial" w:eastAsia="Arial" w:hAnsi="Arial" w:cs="Arial"/>
-                <w:bCs/>
-                <w:color w:val="000000"/>
-                <w:sz w:val="24"/>
-                <w:szCs w:val="24"/>
-                <w:lang w:val="es-US"/>
-              </w:rPr>
-              <w:t xml:space="preserve"> de datos</w:t>
+              <w:t>exfiltración de datos</w:t>
             </w:r>
             <w:r>
               <w:rPr>
@@ -4052,7 +4008,6 @@
               </w:rPr>
               <w:t>La eliminación simple no es segura. Se deben aplicar estándares de </w:t>
             </w:r>
-            <w:proofErr w:type="spellStart"/>
             <w:r>
               <w:rPr>
                 <w:rFonts w:ascii="Arial" w:eastAsia="Arial" w:hAnsi="Arial" w:cs="Arial"/>
@@ -4062,19 +4017,7 @@
                 <w:szCs w:val="24"/>
                 <w:lang w:val="es-US"/>
               </w:rPr>
-              <w:t>sanitización</w:t>
-            </w:r>
-            <w:proofErr w:type="spellEnd"/>
-            <w:r>
-              <w:rPr>
-                <w:rFonts w:ascii="Arial" w:eastAsia="Arial" w:hAnsi="Arial" w:cs="Arial"/>
-                <w:bCs/>
-                <w:color w:val="000000"/>
-                <w:sz w:val="24"/>
-                <w:szCs w:val="24"/>
-                <w:lang w:val="es-US"/>
-              </w:rPr>
-              <w:t xml:space="preserve"> de medios</w:t>
+              <w:t>sanitización de medios</w:t>
             </w:r>
             <w:r>
               <w:rPr>
@@ -4169,7 +4112,7 @@
 </file>
 
 <file path=word/numbering.xml><?xml version="1.0" encoding="utf-8"?>
-<w:numbering xmlns:wpc="http://schemas.microsoft.com/office/word/2010/wordprocessingCanvas" xmlns:cx="http://schemas.microsoft.com/office/drawing/2014/chartex" xmlns:cx1="http://schemas.microsoft.com/office/drawing/2015/9/8/chartex" xmlns:mc="http://schemas.openxmlformats.org/markup-compatibility/2006" xmlns:o="urn:schemas-microsoft-com:office:office" xmlns:r="http://schemas.openxmlformats.org/officeDocument/2006/relationships" xmlns:m="http://schemas.openxmlformats.org/officeDocument/2006/math" xmlns:v="urn:schemas-microsoft-com:vml" xmlns:wp14="http://schemas.microsoft.com/office/word/2010/wordprocessingDrawing" xmlns:wp="http://schemas.openxmlformats.org/drawingml/2006/wordprocessingDrawing" xmlns:w10="urn:schemas-microsoft-com:office:word" xmlns:w="http://schemas.openxmlformats.org/wordprocessingml/2006/main" xmlns:w14="http://schemas.microsoft.com/office/word/2010/wordml" xmlns:w15="http://schemas.microsoft.com/office/word/2012/wordml" xmlns:w16se="http://schemas.microsoft.com/office/word/2015/wordml/symex" xmlns:wpg="http://schemas.microsoft.com/office/word/2010/wordprocessingGroup" xmlns:wpi="http://schemas.microsoft.com/office/word/2010/wordprocessingInk" xmlns:wne="http://schemas.microsoft.com/office/word/2006/wordml" xmlns:wps="http://schemas.microsoft.com/office/word/2010/wordprocessingShape" mc:Ignorable="w14 w15 w16se wp14">
+<w:numbering xmlns:wpc="http://schemas.microsoft.com/office/word/2010/wordprocessingCanvas" xmlns:cx="http://schemas.microsoft.com/office/drawing/2014/chartex" xmlns:cx1="http://schemas.microsoft.com/office/drawing/2015/9/8/chartex" xmlns:cx2="http://schemas.microsoft.com/office/drawing/2015/10/21/chartex" xmlns:cx3="http://schemas.microsoft.com/office/drawing/2016/5/9/chartex" xmlns:cx4="http://schemas.microsoft.com/office/drawing/2016/5/10/chartex" xmlns:cx5="http://schemas.microsoft.com/office/drawing/2016/5/11/chartex" xmlns:cx6="http://schemas.microsoft.com/office/drawing/2016/5/12/chartex" xmlns:cx7="http://schemas.microsoft.com/office/drawing/2016/5/13/chartex" xmlns:cx8="http://schemas.microsoft.com/office/drawing/2016/5/14/chartex" xmlns:mc="http://schemas.openxmlformats.org/markup-compatibility/2006" xmlns:aink="http://schemas.microsoft.com/office/drawing/2016/ink" xmlns:am3d="http://schemas.microsoft.com/office/drawing/2017/model3d" xmlns:o="urn:schemas-microsoft-com:office:office" xmlns:r="http://schemas.openxmlformats.org/officeDocument/2006/relationships" xmlns:m="http://schemas.openxmlformats.org/officeDocument/2006/math" xmlns:v="urn:schemas-microsoft-com:vml" xmlns:wp14="http://schemas.microsoft.com/office/word/2010/wordprocessingDrawing" xmlns:wp="http://schemas.openxmlformats.org/drawingml/2006/wordprocessingDrawing" xmlns:w10="urn:schemas-microsoft-com:office:word" xmlns:w="http://schemas.openxmlformats.org/wordprocessingml/2006/main" xmlns:w14="http://schemas.microsoft.com/office/word/2010/wordml" xmlns:w15="http://schemas.microsoft.com/office/word/2012/wordml" xmlns:w16cex="http://schemas.microsoft.com/office/word/2018/wordml/cex" xmlns:w16cid="http://schemas.microsoft.com/office/word/2016/wordml/cid" xmlns:w16="http://schemas.microsoft.com/office/word/2018/wordml" xmlns:w16sdtdh="http://schemas.microsoft.com/office/word/2020/wordml/sdtdatahash" xmlns:w16se="http://schemas.microsoft.com/office/word/2015/wordml/symex" xmlns:wpg="http://schemas.microsoft.com/office/word/2010/wordprocessingGroup" xmlns:wpi="http://schemas.microsoft.com/office/word/2010/wordprocessingInk" xmlns:wne="http://schemas.microsoft.com/office/word/2006/wordml" xmlns:wps="http://schemas.microsoft.com/office/word/2010/wordprocessingShape" mc:Ignorable="w14 w15 w16se w16cid w16 w16cex w16sdtdh wp14">
   <w:abstractNum w:abstractNumId="0" w15:restartNumberingAfterBreak="0">
     <w:nsid w:val="40832473"/>
     <w:multiLevelType w:val="multilevel"/>
@@ -4263,7 +4206,7 @@
 </file>
 
 <file path=word/styles.xml><?xml version="1.0" encoding="utf-8"?>
-<w:styles xmlns:mc="http://schemas.openxmlformats.org/markup-compatibility/2006" xmlns:r="http://schemas.openxmlformats.org/officeDocument/2006/relationships" xmlns:w="http://schemas.openxmlformats.org/wordprocessingml/2006/main" xmlns:w14="http://schemas.microsoft.com/office/word/2010/wordml" xmlns:w15="http://schemas.microsoft.com/office/word/2012/wordml" xmlns:w16se="http://schemas.microsoft.com/office/word/2015/wordml/symex" mc:Ignorable="w14 w15 w16se">
+<w:styles xmlns:mc="http://schemas.openxmlformats.org/markup-compatibility/2006" xmlns:r="http://schemas.openxmlformats.org/officeDocument/2006/relationships" xmlns:w="http://schemas.openxmlformats.org/wordprocessingml/2006/main" xmlns:w14="http://schemas.microsoft.com/office/word/2010/wordml" xmlns:w15="http://schemas.microsoft.com/office/word/2012/wordml" xmlns:w16cex="http://schemas.microsoft.com/office/word/2018/wordml/cex" xmlns:w16cid="http://schemas.microsoft.com/office/word/2016/wordml/cid" xmlns:w16="http://schemas.microsoft.com/office/word/2018/wordml" xmlns:w16sdtdh="http://schemas.microsoft.com/office/word/2020/wordml/sdtdatahash" xmlns:w16se="http://schemas.microsoft.com/office/word/2015/wordml/symex" mc:Ignorable="w14 w15 w16se w16cid w16 w16cex w16sdtdh">
   <w:docDefaults>
     <w:rPrDefault>
       <w:rPr>
@@ -4279,7 +4222,7 @@
       </w:pPr>
     </w:pPrDefault>
   </w:docDefaults>
-  <w:latentStyles w:defLockedState="0" w:defUIPriority="99" w:defSemiHidden="0" w:defUnhideWhenUsed="0" w:defQFormat="0" w:count="371">
+  <w:latentStyles w:defLockedState="0" w:defUIPriority="99" w:defSemiHidden="0" w:defUnhideWhenUsed="0" w:defQFormat="0" w:count="376">
     <w:lsdException w:name="Normal" w:uiPriority="0" w:qFormat="1"/>
     <w:lsdException w:name="heading 1" w:uiPriority="9" w:qFormat="1"/>
     <w:lsdException w:name="heading 2" w:semiHidden="1" w:uiPriority="9" w:unhideWhenUsed="1" w:qFormat="1"/>
@@ -4385,7 +4328,6 @@
     <w:lsdException w:name="HTML Sample" w:semiHidden="1" w:unhideWhenUsed="1"/>
     <w:lsdException w:name="HTML Typewriter" w:semiHidden="1" w:unhideWhenUsed="1"/>
     <w:lsdException w:name="HTML Variable" w:semiHidden="1" w:unhideWhenUsed="1"/>
-    <w:lsdException w:name="Normal Table" w:semiHidden="1" w:unhideWhenUsed="1"/>
     <w:lsdException w:name="annotation subject" w:semiHidden="1" w:unhideWhenUsed="1"/>
     <w:lsdException w:name="No List" w:semiHidden="1" w:unhideWhenUsed="1"/>
     <w:lsdException w:name="Outline List 1" w:semiHidden="1" w:unhideWhenUsed="1"/>
@@ -4428,11 +4370,8 @@
     <w:lsdException w:name="Table Contemporary" w:semiHidden="1" w:unhideWhenUsed="1"/>
     <w:lsdException w:name="Table Elegant" w:semiHidden="1" w:unhideWhenUsed="1"/>
     <w:lsdException w:name="Table Professional" w:semiHidden="1" w:unhideWhenUsed="1"/>
-    <w:lsdException w:name="Table Subtle 1" w:semiHidden="1" w:unhideWhenUsed="1"/>
     <w:lsdException w:name="Table Subtle 2" w:semiHidden="1" w:unhideWhenUsed="1"/>
     <w:lsdException w:name="Table Web 1" w:semiHidden="1" w:unhideWhenUsed="1"/>
-    <w:lsdException w:name="Table Web 2" w:semiHidden="1" w:unhideWhenUsed="1"/>
-    <w:lsdException w:name="Table Web 3" w:semiHidden="1" w:unhideWhenUsed="1"/>
     <w:lsdException w:name="Balloon Text" w:semiHidden="1" w:unhideWhenUsed="1"/>
     <w:lsdException w:name="Table Grid" w:uiPriority="39"/>
     <w:lsdException w:name="Table Theme" w:semiHidden="1" w:unhideWhenUsed="1"/>
@@ -4651,6 +4590,11 @@
     <w:lsdException w:name="List Table 5 Dark Accent 6" w:uiPriority="50"/>
     <w:lsdException w:name="List Table 6 Colorful Accent 6" w:uiPriority="51"/>
     <w:lsdException w:name="List Table 7 Colorful Accent 6" w:uiPriority="52"/>
+    <w:lsdException w:name="Mention" w:semiHidden="1" w:unhideWhenUsed="1"/>
+    <w:lsdException w:name="Smart Hyperlink" w:semiHidden="1" w:unhideWhenUsed="1"/>
+    <w:lsdException w:name="Hashtag" w:semiHidden="1" w:unhideWhenUsed="1"/>
+    <w:lsdException w:name="Unresolved Mention" w:semiHidden="1" w:unhideWhenUsed="1"/>
+    <w:lsdException w:name="Smart Link" w:semiHidden="1" w:unhideWhenUsed="1"/>
   </w:latentStyles>
   <w:style w:type="paragraph" w:default="1" w:styleId="Normal">
     <w:name w:val="Normal"/>
@@ -4753,6 +4697,7 @@
   <w:style w:type="character" w:default="1" w:styleId="Fuentedeprrafopredeter">
     <w:name w:val="Default Paragraph Font"/>
     <w:uiPriority w:val="1"/>
+    <w:semiHidden/>
     <w:unhideWhenUsed/>
   </w:style>
   <w:style w:type="table" w:default="1" w:styleId="Tablanormal">

</xml_diff>